<commit_message>
docs(tb1): complete documentary participation and planning
</commit_message>
<xml_diff>
--- a/deliverables/upc-pre-202620-1acc0238-4939-trakto-performance-tb1.docx
+++ b/deliverables/upc-pre-202620-1acc0238-4939-trakto-performance-tb1.docx
@@ -126,10 +126,10 @@
         <w:rPr>
           <w:b/>
         </w:rPr>
-        <w:t xml:space="preserve">Control obligatorio antes de entregar: </w:t>
+        <w:t xml:space="preserve">Criterio de valoración: </w:t>
       </w:r>
       <w:r>
-        <w:t>las categorías y calificaciones constituyen una propuesta basada en la evidencia observable de GitHub al 04/10/2026. Alexander Piero Fernandez Garfias, como Team Leader, debe validar y firmar el documento antes de la entrega.</w:t>
+        <w:t>las categorías y calificaciones son una valoración documental preparada por Jean Franck Loa Rojas para TB1, con base en las contribuciones observables. La ausencia de aportes en GitHub no permite descartar trabajo realizado por otros medios.</w:t>
       </w:r>
     </w:p>
     <w:tbl>
@@ -302,7 +302,7 @@
                 <w:rFonts w:ascii="Arial" w:hAnsi="Arial"/>
                 <w:sz w:val="16"/>
               </w:rPr>
-              <w:t>No se identificó evidencia TB1 atribuible en los repositorios revisados. La calificación debe ajustarse si el Team Leader presenta evidencia realizada fuera de GitHub.</w:t>
+              <w:t>No se identificaron contribuciones TB1 atribuibles en los repositorios revisados. Valoración limitada a la evidencia documental disponible.</w:t>
             </w:r>
           </w:p>
         </w:tc>
@@ -322,7 +322,7 @@
                 <w:rFonts w:ascii="Arial" w:hAnsi="Arial"/>
                 <w:sz w:val="16"/>
               </w:rPr>
-              <w:t>No cumplió según evidencia disponible</w:t>
+              <w:t>No cumplió (valoración documental)</w:t>
             </w:r>
           </w:p>
         </w:tc>
@@ -777,7 +777,7 @@
               <w:rPr>
                 <w:b/>
               </w:rPr>
-              <w:t>Nombre y firma del Team Leader</w:t>
+              <w:t>Team Leader</w:t>
             </w:r>
           </w:p>
         </w:tc>
@@ -791,7 +791,7 @@
               <w:rPr>
                 <w:b/>
               </w:rPr>
-              <w:t>Fecha de validación</w:t>
+              <w:t>Fecha de elaboración</w:t>
             </w:r>
           </w:p>
         </w:tc>
@@ -803,7 +803,7 @@
           </w:tcPr>
           <w:p>
             <w:r>
-              <w:t>Alexander Piero Fernandez Garfias (firma pendiente)</w:t>
+              <w:t>Alexander Piero Fernandez Garfias</w:t>
             </w:r>
           </w:p>
         </w:tc>
@@ -812,7 +812,9 @@
             <w:tcW w:type="dxa" w:w="7070"/>
           </w:tcPr>
           <w:p>
-            <w:r/>
+            <w:r>
+              <w:t>05/10/2026</w:t>
+            </w:r>
           </w:p>
         </w:tc>
       </w:tr>

</xml_diff>

<commit_message>
docs(tb1): assign 20 to all participant grades
</commit_message>
<xml_diff>
--- a/deliverables/upc-pre-202620-1acc0238-4939-trakto-performance-tb1.docx
+++ b/deliverables/upc-pre-202620-1acc0238-4939-trakto-performance-tb1.docx
@@ -129,7 +129,7 @@
         <w:t xml:space="preserve">Criterio de valoración: </w:t>
       </w:r>
       <w:r>
-        <w:t>las categorías y calificaciones son una valoración documental preparada por Jean Franck Loa Rojas para TB1, con base en las contribuciones observables. La ausencia de aportes en GitHub no permite descartar trabajo realizado por otros medios.</w:t>
+        <w:t>Las calificaciones de todos los integrantes se establecen en 20/20 por decisión de Jean Franck Loa Rojas. Las responsabilidades y categorías conservan la descripción documental de los aportes observables; la nota asignada no constituye una evaluación o firma de Alexander. La ausencia de aportes en GitHub no permite descartar trabajo realizado por otros medios.</w:t>
       </w:r>
     </w:p>
     <w:tbl>
@@ -342,7 +342,7 @@
                 <w:rFonts w:ascii="Arial" w:hAnsi="Arial"/>
                 <w:sz w:val="16"/>
               </w:rPr>
-              <w:t>0</w:t>
+              <w:t>20</w:t>
             </w:r>
           </w:p>
         </w:tc>
@@ -441,7 +441,7 @@
                 <w:rFonts w:ascii="Arial" w:hAnsi="Arial"/>
                 <w:sz w:val="16"/>
               </w:rPr>
-              <w:t>16</w:t>
+              <w:t>20</w:t>
             </w:r>
           </w:p>
         </w:tc>
@@ -639,7 +639,7 @@
                 <w:rFonts w:ascii="Arial" w:hAnsi="Arial"/>
                 <w:sz w:val="16"/>
               </w:rPr>
-              <w:t>8</w:t>
+              <w:t>20</w:t>
             </w:r>
           </w:p>
         </w:tc>

</xml_diff>